<commit_message>
day 12 (kube rescr )
</commit_message>
<xml_diff>
--- a/day11/WORKER.docx
+++ b/day11/WORKER.docx
@@ -882,24 +882,39 @@
     <w:p>
       <w:pPr>
         <w:shd w:val="clear" w:color="auto" w:fill="FFFFFF" w:themeFill="background1"/>
+        <w:rPr>
+          <w:highlight w:val="yellow"/>
+        </w:rPr>
       </w:pPr>
       <w:r>
         <w:t xml:space="preserve">  </w:t>
       </w:r>
       <w:proofErr w:type="spellStart"/>
       <w:r>
+        <w:rPr>
+          <w:highlight w:val="yellow"/>
+        </w:rPr>
         <w:t>mkdir</w:t>
       </w:r>
       <w:proofErr w:type="spellEnd"/>
       <w:r>
+        <w:rPr>
+          <w:highlight w:val="yellow"/>
+        </w:rPr>
         <w:t xml:space="preserve"> -p $HOME</w:t>
       </w:r>
       <w:proofErr w:type="gramStart"/>
       <w:r>
+        <w:rPr>
+          <w:highlight w:val="yellow"/>
+        </w:rPr>
         <w:t>/.</w:t>
       </w:r>
       <w:proofErr w:type="spellStart"/>
       <w:r>
+        <w:rPr>
+          <w:highlight w:val="yellow"/>
+        </w:rPr>
         <w:t>kube</w:t>
       </w:r>
       <w:proofErr w:type="spellEnd"/>
@@ -908,53 +923,92 @@
     <w:p>
       <w:pPr>
         <w:shd w:val="clear" w:color="auto" w:fill="FFFFFF" w:themeFill="background1"/>
-      </w:pPr>
-      <w:r>
+        <w:rPr>
+          <w:highlight w:val="yellow"/>
+        </w:rPr>
+      </w:pPr>
+      <w:r>
+        <w:rPr>
+          <w:highlight w:val="yellow"/>
+        </w:rPr>
         <w:t xml:space="preserve">  </w:t>
       </w:r>
       <w:proofErr w:type="spellStart"/>
       <w:r>
+        <w:rPr>
+          <w:highlight w:val="yellow"/>
+        </w:rPr>
         <w:t>sudo</w:t>
       </w:r>
       <w:proofErr w:type="spellEnd"/>
       <w:r>
+        <w:rPr>
+          <w:highlight w:val="yellow"/>
+        </w:rPr>
         <w:t xml:space="preserve"> cp -</w:t>
       </w:r>
       <w:proofErr w:type="spellStart"/>
       <w:r>
+        <w:rPr>
+          <w:highlight w:val="yellow"/>
+        </w:rPr>
         <w:t>i</w:t>
       </w:r>
       <w:proofErr w:type="spellEnd"/>
       <w:r>
+        <w:rPr>
+          <w:highlight w:val="yellow"/>
+        </w:rPr>
         <w:t xml:space="preserve"> /etc/</w:t>
       </w:r>
       <w:proofErr w:type="spellStart"/>
       <w:r>
+        <w:rPr>
+          <w:highlight w:val="yellow"/>
+        </w:rPr>
         <w:t>kubernetes</w:t>
       </w:r>
       <w:proofErr w:type="spellEnd"/>
       <w:r>
+        <w:rPr>
+          <w:highlight w:val="yellow"/>
+        </w:rPr>
         <w:t>/</w:t>
       </w:r>
       <w:proofErr w:type="spellStart"/>
       <w:r>
+        <w:rPr>
+          <w:highlight w:val="yellow"/>
+        </w:rPr>
         <w:t>admin.conf</w:t>
       </w:r>
       <w:proofErr w:type="spellEnd"/>
       <w:r>
+        <w:rPr>
+          <w:highlight w:val="yellow"/>
+        </w:rPr>
         <w:t xml:space="preserve"> $HOME</w:t>
       </w:r>
       <w:proofErr w:type="gramStart"/>
       <w:r>
+        <w:rPr>
+          <w:highlight w:val="yellow"/>
+        </w:rPr>
         <w:t>/.</w:t>
       </w:r>
       <w:proofErr w:type="spellStart"/>
       <w:r>
+        <w:rPr>
+          <w:highlight w:val="yellow"/>
+        </w:rPr>
         <w:t>kube</w:t>
       </w:r>
       <w:proofErr w:type="spellEnd"/>
       <w:proofErr w:type="gramEnd"/>
       <w:r>
+        <w:rPr>
+          <w:highlight w:val="yellow"/>
+        </w:rPr>
         <w:t>/config</w:t>
       </w:r>
     </w:p>
@@ -963,38 +1017,65 @@
         <w:shd w:val="clear" w:color="auto" w:fill="FFFFFF" w:themeFill="background1"/>
       </w:pPr>
       <w:r>
+        <w:rPr>
+          <w:highlight w:val="yellow"/>
+        </w:rPr>
         <w:t xml:space="preserve">  </w:t>
       </w:r>
       <w:proofErr w:type="spellStart"/>
       <w:r>
+        <w:rPr>
+          <w:highlight w:val="yellow"/>
+        </w:rPr>
         <w:t>sudo</w:t>
       </w:r>
       <w:proofErr w:type="spellEnd"/>
       <w:r>
-        <w:t xml:space="preserve"> </w:t>
-      </w:r>
-      <w:proofErr w:type="spellStart"/>
-      <w:r>
+        <w:rPr>
+          <w:highlight w:val="yellow"/>
+        </w:rPr>
+        <w:t xml:space="preserve"> </w:t>
+      </w:r>
+      <w:proofErr w:type="spellStart"/>
+      <w:r>
+        <w:rPr>
+          <w:highlight w:val="yellow"/>
+        </w:rPr>
         <w:t>chown</w:t>
       </w:r>
       <w:proofErr w:type="spellEnd"/>
       <w:r>
+        <w:rPr>
+          <w:highlight w:val="yellow"/>
+        </w:rPr>
         <w:t xml:space="preserve"> $(id -u</w:t>
       </w:r>
       <w:proofErr w:type="gramStart"/>
       <w:r>
+        <w:rPr>
+          <w:highlight w:val="yellow"/>
+        </w:rPr>
         <w:t>):$</w:t>
       </w:r>
       <w:proofErr w:type="gramEnd"/>
       <w:r>
+        <w:rPr>
+          <w:highlight w:val="yellow"/>
+        </w:rPr>
         <w:t>(id -g) $HOME/.</w:t>
       </w:r>
       <w:proofErr w:type="spellStart"/>
       <w:r>
+        <w:rPr>
+          <w:highlight w:val="yellow"/>
+        </w:rPr>
         <w:t>kube</w:t>
       </w:r>
       <w:proofErr w:type="spellEnd"/>
       <w:r>
+        <w:rPr>
+          <w:highlight w:val="yellow"/>
+        </w:rPr>
         <w:t>/config</w:t>
       </w:r>
     </w:p>
@@ -1011,18 +1092,33 @@
         <w:shd w:val="clear" w:color="auto" w:fill="FFFFFF" w:themeFill="background1"/>
       </w:pPr>
       <w:r>
-        <w:t xml:space="preserve">  export KUBECONFIG=/etc/</w:t>
-      </w:r>
-      <w:proofErr w:type="spellStart"/>
-      <w:r>
+        <w:t xml:space="preserve">  </w:t>
+      </w:r>
+      <w:r>
+        <w:rPr>
+          <w:highlight w:val="yellow"/>
+        </w:rPr>
+        <w:t>export KUBECONFIG=/etc/</w:t>
+      </w:r>
+      <w:proofErr w:type="spellStart"/>
+      <w:r>
+        <w:rPr>
+          <w:highlight w:val="yellow"/>
+        </w:rPr>
         <w:t>kubernetes</w:t>
       </w:r>
       <w:proofErr w:type="spellEnd"/>
       <w:r>
+        <w:rPr>
+          <w:highlight w:val="yellow"/>
+        </w:rPr>
         <w:t>/</w:t>
       </w:r>
       <w:proofErr w:type="spellStart"/>
       <w:r>
+        <w:rPr>
+          <w:highlight w:val="yellow"/>
+        </w:rPr>
         <w:t>admin.conf</w:t>
       </w:r>
       <w:proofErr w:type="spellEnd"/>
@@ -1253,6 +1349,190 @@
       </w:r>
     </w:p>
     <w:p/>
+    <w:p>
+      <w:proofErr w:type="spellStart"/>
+      <w:r>
+        <w:rPr>
+          <w:highlight w:val="yellow"/>
+        </w:rPr>
+        <w:t>kubectl</w:t>
+      </w:r>
+      <w:proofErr w:type="spellEnd"/>
+      <w:r>
+        <w:rPr>
+          <w:highlight w:val="yellow"/>
+        </w:rPr>
+        <w:t xml:space="preserve"> get nodes</w:t>
+      </w:r>
+      <w:r>
+        <w:t xml:space="preserve"> (should show ready/not ready)</w:t>
+      </w:r>
+    </w:p>
+    <w:p/>
+    <w:p>
+      <w:proofErr w:type="spellStart"/>
+      <w:r>
+        <w:t>sudo</w:t>
+      </w:r>
+      <w:proofErr w:type="spellEnd"/>
+      <w:r>
+        <w:t xml:space="preserve"> nano /etc/</w:t>
+      </w:r>
+      <w:proofErr w:type="spellStart"/>
+      <w:proofErr w:type="gramStart"/>
+      <w:r>
+        <w:t>fstab</w:t>
+      </w:r>
+      <w:proofErr w:type="spellEnd"/>
+      <w:r>
+        <w:t xml:space="preserve">  (</w:t>
+      </w:r>
+      <w:proofErr w:type="gramEnd"/>
+      <w:r>
+        <w:t>default swap off)</w:t>
+      </w:r>
+    </w:p>
+    <w:p>
+      <w:proofErr w:type="spellStart"/>
+      <w:r>
+        <w:t>systemctl</w:t>
+      </w:r>
+      <w:proofErr w:type="spellEnd"/>
+      <w:r>
+        <w:t xml:space="preserve"> status </w:t>
+      </w:r>
+      <w:proofErr w:type="spellStart"/>
+      <w:r>
+        <w:t>containerd</w:t>
+      </w:r>
+      <w:proofErr w:type="spellEnd"/>
+    </w:p>
+    <w:p>
+      <w:proofErr w:type="spellStart"/>
+      <w:r>
+        <w:t>systemctl</w:t>
+      </w:r>
+      <w:proofErr w:type="spellEnd"/>
+      <w:r>
+        <w:t xml:space="preserve"> status </w:t>
+      </w:r>
+      <w:proofErr w:type="spellStart"/>
+      <w:r>
+        <w:t>kubelet</w:t>
+      </w:r>
+      <w:proofErr w:type="spellEnd"/>
+    </w:p>
+    <w:p>
+      <w:proofErr w:type="spellStart"/>
+      <w:r>
+        <w:t>sudo</w:t>
+      </w:r>
+      <w:proofErr w:type="spellEnd"/>
+      <w:r>
+        <w:t xml:space="preserve"> </w:t>
+      </w:r>
+      <w:proofErr w:type="spellStart"/>
+      <w:r>
+        <w:t>crictl</w:t>
+      </w:r>
+      <w:proofErr w:type="spellEnd"/>
+      <w:r>
+        <w:t xml:space="preserve"> </w:t>
+      </w:r>
+      <w:proofErr w:type="spellStart"/>
+      <w:r>
+        <w:t>ps</w:t>
+      </w:r>
+      <w:proofErr w:type="spellEnd"/>
+    </w:p>
+    <w:p>
+      <w:proofErr w:type="spellStart"/>
+      <w:r>
+        <w:lastRenderedPageBreak/>
+        <w:t>sudo</w:t>
+      </w:r>
+      <w:proofErr w:type="spellEnd"/>
+      <w:r>
+        <w:t xml:space="preserve"> </w:t>
+      </w:r>
+      <w:proofErr w:type="spellStart"/>
+      <w:r>
+        <w:t>systemctl</w:t>
+      </w:r>
+      <w:proofErr w:type="spellEnd"/>
+      <w:r>
+        <w:t xml:space="preserve"> daemon-</w:t>
+      </w:r>
+      <w:proofErr w:type="spellStart"/>
+      <w:r>
+        <w:t>reexec</w:t>
+      </w:r>
+      <w:proofErr w:type="spellEnd"/>
+    </w:p>
+    <w:p>
+      <w:proofErr w:type="spellStart"/>
+      <w:r>
+        <w:t>sudo</w:t>
+      </w:r>
+      <w:proofErr w:type="spellEnd"/>
+      <w:r>
+        <w:t xml:space="preserve"> </w:t>
+      </w:r>
+      <w:proofErr w:type="spellStart"/>
+      <w:r>
+        <w:t>systemctl</w:t>
+      </w:r>
+      <w:proofErr w:type="spellEnd"/>
+      <w:r>
+        <w:t xml:space="preserve"> daemon-reload</w:t>
+      </w:r>
+    </w:p>
+    <w:p>
+      <w:proofErr w:type="spellStart"/>
+      <w:r>
+        <w:t>sudo</w:t>
+      </w:r>
+      <w:proofErr w:type="spellEnd"/>
+      <w:r>
+        <w:t xml:space="preserve"> </w:t>
+      </w:r>
+      <w:proofErr w:type="spellStart"/>
+      <w:r>
+        <w:t>systemctl</w:t>
+      </w:r>
+      <w:proofErr w:type="spellEnd"/>
+      <w:r>
+        <w:t xml:space="preserve"> restart </w:t>
+      </w:r>
+      <w:proofErr w:type="spellStart"/>
+      <w:r>
+        <w:t>containerd</w:t>
+      </w:r>
+      <w:proofErr w:type="spellEnd"/>
+    </w:p>
+    <w:p>
+      <w:proofErr w:type="spellStart"/>
+      <w:r>
+        <w:t>sudo</w:t>
+      </w:r>
+      <w:proofErr w:type="spellEnd"/>
+      <w:r>
+        <w:t xml:space="preserve"> </w:t>
+      </w:r>
+      <w:proofErr w:type="spellStart"/>
+      <w:r>
+        <w:t>systemctl</w:t>
+      </w:r>
+      <w:proofErr w:type="spellEnd"/>
+      <w:r>
+        <w:t xml:space="preserve"> restart </w:t>
+      </w:r>
+      <w:proofErr w:type="spellStart"/>
+      <w:r>
+        <w:t>kubelet</w:t>
+      </w:r>
+      <w:proofErr w:type="spellEnd"/>
+    </w:p>
     <w:sectPr>
       <w:pgSz w:w="11906" w:h="16838"/>
       <w:pgMar w:top="1440" w:right="1440" w:bottom="1440" w:left="1440" w:header="708" w:footer="708" w:gutter="0"/>

</xml_diff>